<commit_message>
Update Pipedrive SOP to revised version 1.1
</commit_message>
<xml_diff>
--- a/pipedrive-crm-sop.docx
+++ b/pipedrive-crm-sop.docx
@@ -259,7 +259,7 @@
           <w:sz w:val="18"/>
           <w:szCs w:val="18"/>
         </w:rPr>
-        <w:t xml:space="preserve">This SOP accompanies the September 2026 Monthly Performance Report. All company names, project names, amounts, and timeframes are fictional sample content. Pipedrive menu names and available features can vary by plan and account setup.</w:t>
+        <w:t xml:space="preserve">This SOP is an independent portfolio practice project. All company names, project names, amounts, and timeframes are fictional sample content. Pipedrive menu names and available features can vary by plan and account setup.</w:t>
       </w:r>
     </w:p>
     <w:p>
@@ -293,7 +293,7 @@
           <w:sz w:val="21"/>
           <w:szCs w:val="21"/>
         </w:rPr>
-        <w:t xml:space="preserve">To keep every deal in Pipedrive accurate, current, and easy to find, so follow-ups are not missed and the monthly report can be built straight from Pipedrive without reconciling by hand. This procedure covers every residential, rental turnover, and commercial opportunity from first inquiry to closeout. Each figure in the Monthly Performance Report is pulled from records kept to this standard.</w:t>
+        <w:t xml:space="preserve">This procedure keeps every deal in Pipedrive accurate, current, and easy to find, so follow-ups are not missed and the monthly report can be built straight from Pipedrive without manual reconciliation. It covers every sales and project opportunity from first inquiry to closeout. Each figure in the monthly report is pulled from records kept to this standard.</w:t>
       </w:r>
     </w:p>
     <w:p>
@@ -540,7 +540,7 @@
                 <w:sz w:val="19"/>
                 <w:szCs w:val="19"/>
               </w:rPr>
-              <w:t xml:space="preserve">Stage in the project pipeline</w:t>
+              <w:t xml:space="preserve">Open stage in the project pipeline</w:t>
             </w:r>
           </w:p>
         </w:tc>
@@ -832,7 +832,7 @@
                 <w:sz w:val="19"/>
                 <w:szCs w:val="19"/>
               </w:rPr>
-              <w:t xml:space="preserve">Activity that is overdue or not yet marked as done</w:t>
+              <w:t xml:space="preserve">Open activity with a due date earlier than the reporting cutoff date that has not been marked as done</w:t>
             </w:r>
           </w:p>
         </w:tc>
@@ -1089,7 +1089,7 @@
           <w:sz w:val="21"/>
           <w:szCs w:val="21"/>
         </w:rPr>
-        <w:t xml:space="preserve">Every open deal sits in exactly one stage and is moved the same day its status changes. Closed is not a stage: finished work is marked Won.</w:t>
+        <w:t xml:space="preserve">Every open deal sits in exactly one of six stages and is moved the same day its status changes. Won and Lost are closed deal outcomes, not stages (see Deal closure below).</w:t>
       </w:r>
     </w:p>
     <w:p>
@@ -1100,9 +1100,9 @@
       <w:r>
         <w:drawing>
           <wp:inline distT="0" distB="0" distL="0" distR="0">
-            <wp:extent cx="5334000" cy="1343025"/>
+            <wp:extent cx="5334000" cy="1202830"/>
             <wp:effectExtent t="0" r="0" b="0" l="0"/>
-            <wp:docPr id="1" name="flow" descr="Flow: New/Unreviewed, Qualified, Bidding/Estimate, Proposal Sent, Awarded, In Progress, Won. Any open deal can be marked Lost." title="Pipeline stages"/>
+            <wp:docPr id="1" name="flow" descr="Open pipeline flow: New / Unreviewed, Qualified, Bidding / Estimate, Proposal Sent, Awarded, In Progress. Closed outcomes shown separately: Won and Lost. Any open deal can be marked Lost." title="Pipeline stages"/>
             <wp:cNvGraphicFramePr>
               <a:graphicFrameLocks xmlns:a="http://schemas.openxmlformats.org/drawingml/2006/main" noChangeAspect="1"/>
             </wp:cNvGraphicFramePr>
@@ -1125,7 +1125,7 @@
                   <pic:spPr bwMode="auto">
                     <a:xfrm>
                       <a:off x="0" y="0"/>
-                      <a:ext cx="5334000" cy="1343025"/>
+                      <a:ext cx="5334000" cy="1202830"/>
                     </a:xfrm>
                     <a:prstGeom prst="rect">
                       <a:avLst/>
@@ -1136,6 +1136,85 @@
             </a:graphic>
           </wp:inline>
         </w:drawing>
+      </w:r>
+    </w:p>
+    <w:p>
+      <w:pPr>
+        <w:keepNext/>
+        <w:spacing w:after="70" w:before="40"/>
+      </w:pPr>
+      <w:r>
+        <w:rPr>
+          <w:rFonts w:ascii="Calibri" w:cs="Calibri" w:eastAsia="Calibri" w:hAnsi="Calibri"/>
+          <w:b/>
+          <w:bCs/>
+          <w:color w:val="6B7570"/>
+          <w:spacing w:val="20"/>
+          <w:sz w:val="16"/>
+          <w:szCs w:val="16"/>
+        </w:rPr>
+        <w:t xml:space="preserve">DEAL CLOSURE</w:t>
+      </w:r>
+    </w:p>
+    <w:p>
+      <w:pPr>
+        <w:pStyle w:val="ListParagraph"/>
+        <w:keepNext/>
+        <w:numPr>
+          <w:ilvl w:val="0"/>
+          <w:numId w:val="3"/>
+        </w:numPr>
+        <w:spacing w:after="40" w:line="250"/>
+      </w:pPr>
+      <w:r>
+        <w:rPr>
+          <w:rFonts w:ascii="Calibri" w:cs="Calibri" w:eastAsia="Calibri" w:hAnsi="Calibri"/>
+          <w:b/>
+          <w:bCs/>
+          <w:color w:val="1F2A26"/>
+          <w:sz w:val="20"/>
+          <w:szCs w:val="20"/>
+        </w:rPr>
+        <w:t xml:space="preserve">Won: </w:t>
+      </w:r>
+      <w:r>
+        <w:rPr>
+          <w:rFonts w:ascii="Calibri" w:cs="Calibri" w:eastAsia="Calibri" w:hAnsi="Calibri"/>
+          <w:color w:val="1F2A26"/>
+          <w:sz w:val="20"/>
+          <w:szCs w:val="20"/>
+        </w:rPr>
+        <w:t xml:space="preserve">work is complete and the final value is entered. The deal leaves the open pipeline and appears in the closed projects table.</w:t>
+      </w:r>
+    </w:p>
+    <w:p>
+      <w:pPr>
+        <w:pStyle w:val="ListParagraph"/>
+        <w:numPr>
+          <w:ilvl w:val="0"/>
+          <w:numId w:val="3"/>
+        </w:numPr>
+        <w:spacing w:after="40" w:line="250"/>
+      </w:pPr>
+      <w:r>
+        <w:rPr>
+          <w:rFonts w:ascii="Calibri" w:cs="Calibri" w:eastAsia="Calibri" w:hAnsi="Calibri"/>
+          <w:b/>
+          <w:bCs/>
+          <w:color w:val="1F2A26"/>
+          <w:sz w:val="20"/>
+          <w:szCs w:val="20"/>
+        </w:rPr>
+        <w:t xml:space="preserve">Lost: </w:t>
+      </w:r>
+      <w:r>
+        <w:rPr>
+          <w:rFonts w:ascii="Calibri" w:cs="Calibri" w:eastAsia="Calibri" w:hAnsi="Calibri"/>
+          <w:color w:val="1F2A26"/>
+          <w:sz w:val="20"/>
+          <w:szCs w:val="20"/>
+        </w:rPr>
+        <w:t xml:space="preserve">the opportunity was declined or went cold, and a Lost reason is recorded. Any open deal can be marked Lost.</w:t>
       </w:r>
     </w:p>
     <w:p>
@@ -2146,147 +2225,6 @@
           </w:p>
         </w:tc>
       </w:tr>
-      <w:tr>
-        <w:trPr>
-          <w:cantSplit/>
-        </w:trPr>
-        <w:tc>
-          <w:tcPr>
-            <w:tcW w:type="dxa" w:w="1650"/>
-            <w:tcBorders>
-              <w:top w:val="none" w:color="FFFFFF" w:sz="0"/>
-              <w:left w:val="none" w:color="FFFFFF" w:sz="0"/>
-              <w:bottom w:val="single" w:color="D5DAD6" w:sz="4"/>
-              <w:right w:val="none" w:color="FFFFFF" w:sz="0"/>
-            </w:tcBorders>
-            <w:tcMar>
-              <w:top w:type="dxa" w:w="55"/>
-              <w:left w:type="dxa" w:w="0"/>
-              <w:bottom w:type="dxa" w:w="55"/>
-              <w:right w:type="dxa" w:w="140"/>
-            </w:tcMar>
-            <w:vAlign w:val="top"/>
-          </w:tcPr>
-          <w:p>
-            <w:pPr>
-              <w:keepNext w:val="false"/>
-            </w:pPr>
-            <w:r>
-              <w:rPr>
-                <w:rFonts w:ascii="Calibri" w:cs="Calibri" w:eastAsia="Calibri" w:hAnsi="Calibri"/>
-                <w:b/>
-                <w:bCs/>
-                <w:color w:val="1F2A26"/>
-                <w:sz w:val="19"/>
-                <w:szCs w:val="19"/>
-              </w:rPr>
-              <w:t xml:space="preserve">Won (Closed)</w:t>
-            </w:r>
-          </w:p>
-        </w:tc>
-        <w:tc>
-          <w:tcPr>
-            <w:tcW w:type="dxa" w:w="2900"/>
-            <w:tcBorders>
-              <w:top w:val="none" w:color="FFFFFF" w:sz="0"/>
-              <w:left w:val="none" w:color="FFFFFF" w:sz="0"/>
-              <w:bottom w:val="single" w:color="D5DAD6" w:sz="4"/>
-              <w:right w:val="none" w:color="FFFFFF" w:sz="0"/>
-            </w:tcBorders>
-            <w:tcMar>
-              <w:top w:type="dxa" w:w="55"/>
-              <w:left w:type="dxa" w:w="0"/>
-              <w:bottom w:type="dxa" w:w="55"/>
-              <w:right w:type="dxa" w:w="140"/>
-            </w:tcMar>
-            <w:vAlign w:val="top"/>
-          </w:tcPr>
-          <w:p>
-            <w:pPr>
-              <w:keepNext w:val="false"/>
-            </w:pPr>
-            <w:r>
-              <w:rPr>
-                <w:rFonts w:ascii="Calibri" w:cs="Calibri" w:eastAsia="Calibri" w:hAnsi="Calibri"/>
-                <w:b w:val="false"/>
-                <w:bCs w:val="false"/>
-                <w:color w:val="6B7570"/>
-                <w:sz w:val="19"/>
-                <w:szCs w:val="19"/>
-              </w:rPr>
-              <w:t xml:space="preserve">Work complete, final value recorded</w:t>
-            </w:r>
-          </w:p>
-        </w:tc>
-        <w:tc>
-          <w:tcPr>
-            <w:tcW w:type="dxa" w:w="3510"/>
-            <w:tcBorders>
-              <w:top w:val="none" w:color="FFFFFF" w:sz="0"/>
-              <w:left w:val="none" w:color="FFFFFF" w:sz="0"/>
-              <w:bottom w:val="single" w:color="D5DAD6" w:sz="4"/>
-              <w:right w:val="none" w:color="FFFFFF" w:sz="0"/>
-            </w:tcBorders>
-            <w:tcMar>
-              <w:top w:type="dxa" w:w="55"/>
-              <w:left w:type="dxa" w:w="0"/>
-              <w:bottom w:type="dxa" w:w="55"/>
-              <w:right w:type="dxa" w:w="140"/>
-            </w:tcMar>
-            <w:vAlign w:val="top"/>
-          </w:tcPr>
-          <w:p>
-            <w:pPr>
-              <w:keepNext w:val="false"/>
-            </w:pPr>
-            <w:r>
-              <w:rPr>
-                <w:rFonts w:ascii="Calibri" w:cs="Calibri" w:eastAsia="Calibri" w:hAnsi="Calibri"/>
-                <w:b w:val="false"/>
-                <w:bCs w:val="false"/>
-                <w:color w:val="6B7570"/>
-                <w:sz w:val="19"/>
-                <w:szCs w:val="19"/>
-              </w:rPr>
-              <w:t xml:space="preserve">Complete closeout (Section 6)</w:t>
-            </w:r>
-          </w:p>
-        </w:tc>
-        <w:tc>
-          <w:tcPr>
-            <w:tcW w:type="dxa" w:w="1300"/>
-            <w:tcBorders>
-              <w:top w:val="none" w:color="FFFFFF" w:sz="0"/>
-              <w:left w:val="none" w:color="FFFFFF" w:sz="0"/>
-              <w:bottom w:val="single" w:color="D5DAD6" w:sz="4"/>
-              <w:right w:val="none" w:color="FFFFFF" w:sz="0"/>
-            </w:tcBorders>
-            <w:tcMar>
-              <w:top w:type="dxa" w:w="55"/>
-              <w:left w:type="dxa" w:w="0"/>
-              <w:bottom w:type="dxa" w:w="55"/>
-              <w:right w:type="dxa" w:w="140"/>
-            </w:tcMar>
-            <w:vAlign w:val="top"/>
-          </w:tcPr>
-          <w:p>
-            <w:pPr>
-              <w:keepNext w:val="false"/>
-            </w:pPr>
-            <w:r>
-              <w:rPr>
-                <w:rFonts w:ascii="Calibri" w:cs="Calibri" w:eastAsia="Calibri" w:hAnsi="Calibri"/>
-                <w:b w:val="false"/>
-                <w:bCs w:val="false"/>
-                <w:color w:val="6B7570"/>
-                <w:sz w:val="19"/>
-                <w:szCs w:val="19"/>
-              </w:rPr>
-              <w:t xml:space="preserve">n/a</w:t>
-            </w:r>
-          </w:p>
-        </w:tc>
-      </w:tr>
     </w:tbl>
     <w:p>
       <w:pPr>
@@ -3149,7 +3087,7 @@
           <w:sz w:val="21"/>
           <w:szCs w:val="21"/>
         </w:rPr>
-        <w:t xml:space="preserve">Every follow-up ends with an outcome note and a next activity. Anything not completed stays as an open activity and is counted as pending in the monthly report.</w:t>
+        <w:t xml:space="preserve">Every follow-up ends with an outcome note and a next activity. Anything not completed stays as an open activity. If its due date is earlier than the reporting cutoff date, it is counted as a pending follow-up in the monthly report.</w:t>
       </w:r>
     </w:p>
     <w:p>
@@ -3416,7 +3354,7 @@
           <w:sz w:val="20"/>
           <w:szCs w:val="20"/>
         </w:rPr>
-        <w:t xml:space="preserve">Pull the stage counts. </w:t>
+        <w:t xml:space="preserve">Pull the pipeline counts. </w:t>
       </w:r>
       <w:r>
         <w:rPr>
@@ -3425,7 +3363,7 @@
           <w:sz w:val="20"/>
           <w:szCs w:val="20"/>
         </w:rPr>
-        <w:t xml:space="preserve">Use an Active pipeline filter (open deals, Qualified through In Progress) and Insights deal reports for deals created, moved to Proposal Sent or Awarded, and won this month.</w:t>
+        <w:t xml:space="preserve">Use one filter for Total Open Deals (all open deals, including New / Unreviewed) and one for Active Qualified Opportunities (open deals from Qualified through In Progress, excluding New / Unreviewed). Use Insights deal reports for deals created, moved to Proposal Sent or Awarded, and won this month.</w:t>
       </w:r>
     </w:p>
     <w:p>
@@ -3455,7 +3393,7 @@
           <w:sz w:val="20"/>
           <w:szCs w:val="20"/>
         </w:rPr>
-        <w:t xml:space="preserve">Use an Insights activity report (activities done), a filter for overdue open activities (pending), a deal filter on Update time (records updated), and a filter on the Priority label.</w:t>
+        <w:t xml:space="preserve">Use an Insights activity report (activities done), a filter for Pending Follow-Ups (open activities with a due date earlier than the reporting cutoff date that are not marked as done), a deal filter on Update time (records updated), and a filter on the Priority label.</w:t>
       </w:r>
     </w:p>
     <w:p>
@@ -3717,7 +3655,7 @@
                 <w:sz w:val="19"/>
                 <w:szCs w:val="19"/>
               </w:rPr>
-              <w:t xml:space="preserve">Snapshot figures match the Pipedrive filters and the pipeline chart.</w:t>
+              <w:t xml:space="preserve">Snapshot figures match the Pipedrive filters and the pipeline chart, and Total Open Deals less Active Qualified Opportunities equals the New / Unreviewed count.</w:t>
             </w:r>
           </w:p>
         </w:tc>
@@ -3859,7 +3797,7 @@
                 <w:sz w:val="19"/>
                 <w:szCs w:val="19"/>
               </w:rPr>
-              <w:t xml:space="preserve">Pending follow-ups equals the number of overdue open activities.</w:t>
+              <w:t xml:space="preserve">Pending Follow-Ups equals the number of open activities due before the reporting cutoff date and not marked as done.</w:t>
             </w:r>
           </w:p>
         </w:tc>
@@ -4001,7 +3939,7 @@
                 <w:sz w:val="19"/>
                 <w:szCs w:val="19"/>
               </w:rPr>
-              <w:t xml:space="preserve">All reports use the same date range, and names and amounts are consistent.</w:t>
+              <w:t xml:space="preserve">All reports use the same date range and reporting cutoff date, and names and amounts are consistent.</w:t>
             </w:r>
           </w:p>
         </w:tc>
@@ -4661,7 +4599,7 @@
         <w:sz w:val="15"/>
         <w:szCs w:val="15"/>
       </w:rPr>
-      <w:t xml:space="preserve">PORTFOLIO WORK SAMPLE  |  REAL ESTATE OPERATIONS</w:t>
+      <w:t xml:space="preserve">PORTFOLIO WORK SAMPLE  |  CRM &amp; PROJECT OPERATIONS</w:t>
     </w:r>
   </w:p>
 </w:hdr>

</xml_diff>